<commit_message>
Add kadai files; update 演習問題.docx
</commit_message>
<xml_diff>
--- a/演習問題/演習問題.docx
+++ b/演習問題/演習問題.docx
@@ -1,6 +1,6 @@
 
 <file path=word/document.xml><?xml version="1.0" encoding="utf-8"?>
-<w:document xmlns:wpc="http://schemas.microsoft.com/office/word/2010/wordprocessingCanvas" xmlns:cx="http://schemas.microsoft.com/office/drawing/2014/chartex" xmlns:cx1="http://schemas.microsoft.com/office/drawing/2015/9/8/chartex" xmlns:cx2="http://schemas.microsoft.com/office/drawing/2015/10/21/chartex" xmlns:cx3="http://schemas.microsoft.com/office/drawing/2016/5/9/chartex" xmlns:cx4="http://schemas.microsoft.com/office/drawing/2016/5/10/chartex" xmlns:cx5="http://schemas.microsoft.com/office/drawing/2016/5/11/chartex" xmlns:cx6="http://schemas.microsoft.com/office/drawing/2016/5/12/chartex" xmlns:cx7="http://schemas.microsoft.com/office/drawing/2016/5/13/chartex" xmlns:cx8="http://schemas.microsoft.com/office/drawing/2016/5/14/chartex" xmlns:mc="http://schemas.openxmlformats.org/markup-compatibility/2006" xmlns:aink="http://schemas.microsoft.com/office/drawing/2016/ink" xmlns:am3d="http://schemas.microsoft.com/office/drawing/2017/model3d" xmlns:o="urn:schemas-microsoft-com:office:office" xmlns:oel="http://schemas.microsoft.com/office/2019/extlst" xmlns:r="http://schemas.openxmlformats.org/officeDocument/2006/relationships" xmlns:m="http://schemas.openxmlformats.org/officeDocument/2006/math" xmlns:v="urn:schemas-microsoft-com:vml" xmlns:wp14="http://schemas.microsoft.com/office/word/2010/wordprocessingDrawing" xmlns:wp="http://schemas.openxmlformats.org/drawingml/2006/wordprocessingDrawing" xmlns:w10="urn:schemas-microsoft-com:office:word" xmlns:w="http://schemas.openxmlformats.org/wordprocessingml/2006/main" xmlns:w14="http://schemas.microsoft.com/office/word/2010/wordml" xmlns:w15="http://schemas.microsoft.com/office/word/2012/wordml" xmlns:w16cex="http://schemas.microsoft.com/office/word/2018/wordml/cex" xmlns:w16cid="http://schemas.microsoft.com/office/word/2016/wordml/cid" xmlns:w16="http://schemas.microsoft.com/office/word/2018/wordml" xmlns:w16sdtdh="http://schemas.microsoft.com/office/word/2020/wordml/sdtdatahash" xmlns:w16se="http://schemas.microsoft.com/office/word/2015/wordml/symex" xmlns:wpg="http://schemas.microsoft.com/office/word/2010/wordprocessingGroup" xmlns:wpi="http://schemas.microsoft.com/office/word/2010/wordprocessingInk" xmlns:wne="http://schemas.microsoft.com/office/word/2006/wordml" xmlns:wps="http://schemas.microsoft.com/office/word/2010/wordprocessingShape" mc:Ignorable="w14 w15 w16se w16cid w16 w16cex w16sdtdh wp14">
+<w:document xmlns:wpc="http://schemas.microsoft.com/office/word/2010/wordprocessingCanvas" xmlns:cx="http://schemas.microsoft.com/office/drawing/2014/chartex" xmlns:cx1="http://schemas.microsoft.com/office/drawing/2015/9/8/chartex" xmlns:cx2="http://schemas.microsoft.com/office/drawing/2015/10/21/chartex" xmlns:cx3="http://schemas.microsoft.com/office/drawing/2016/5/9/chartex" xmlns:cx4="http://schemas.microsoft.com/office/drawing/2016/5/10/chartex" xmlns:cx5="http://schemas.microsoft.com/office/drawing/2016/5/11/chartex" xmlns:cx6="http://schemas.microsoft.com/office/drawing/2016/5/12/chartex" xmlns:cx7="http://schemas.microsoft.com/office/drawing/2016/5/13/chartex" xmlns:cx8="http://schemas.microsoft.com/office/drawing/2016/5/14/chartex" xmlns:mc="http://schemas.openxmlformats.org/markup-compatibility/2006" xmlns:aink="http://schemas.microsoft.com/office/drawing/2016/ink" xmlns:am3d="http://schemas.microsoft.com/office/drawing/2017/model3d" xmlns:o="urn:schemas-microsoft-com:office:office" xmlns:oel="http://schemas.microsoft.com/office/2019/extlst" xmlns:r="http://schemas.openxmlformats.org/officeDocument/2006/relationships" xmlns:m="http://schemas.openxmlformats.org/officeDocument/2006/math" xmlns:v="urn:schemas-microsoft-com:vml" xmlns:wp14="http://schemas.microsoft.com/office/word/2010/wordprocessingDrawing" xmlns:wp="http://schemas.openxmlformats.org/drawingml/2006/wordprocessingDrawing" xmlns:w10="urn:schemas-microsoft-com:office:word" xmlns:w="http://schemas.openxmlformats.org/wordprocessingml/2006/main" xmlns:w14="http://schemas.microsoft.com/office/word/2010/wordml" xmlns:w15="http://schemas.microsoft.com/office/word/2012/wordml" xmlns:w16cex="http://schemas.microsoft.com/office/word/2018/wordml/cex" xmlns:w16cid="http://schemas.microsoft.com/office/word/2016/wordml/cid" xmlns:w16="http://schemas.microsoft.com/office/word/2018/wordml" xmlns:w16du="http://schemas.microsoft.com/office/word/2023/wordml/word16du" xmlns:w16sdtdh="http://schemas.microsoft.com/office/word/2020/wordml/sdtdatahash" xmlns:w16sdtfl="http://schemas.microsoft.com/office/word/2024/wordml/sdtformatlock" xmlns:w16se="http://schemas.microsoft.com/office/word/2015/wordml/symex" xmlns:wpg="http://schemas.microsoft.com/office/word/2010/wordprocessingGroup" xmlns:wpi="http://schemas.microsoft.com/office/word/2010/wordprocessingInk" xmlns:wne="http://schemas.microsoft.com/office/word/2006/wordml" xmlns:wps="http://schemas.microsoft.com/office/word/2010/wordprocessingShape" mc:Ignorable="w14 w15 w16se w16cid w16 w16cex w16sdtdh w16sdtfl w16du wp14">
   <w:body>
     <w:p/>
     <w:p/>
@@ -279,7 +279,7 @@
                     <pic:cNvPicPr/>
                   </pic:nvPicPr>
                   <pic:blipFill>
-                    <a:blip r:embed="rId8">
+                    <a:blip r:embed="rId11">
                       <a:extLst>
                         <a:ext uri="{28A0092B-C50C-407E-A947-70E740481C1C}">
                           <a14:useLocalDpi xmlns:a14="http://schemas.microsoft.com/office/drawing/2010/main" val="0"/>
@@ -501,7 +501,7 @@
                     <pic:cNvPicPr/>
                   </pic:nvPicPr>
                   <pic:blipFill>
-                    <a:blip r:embed="rId9">
+                    <a:blip r:embed="rId12">
                       <a:extLst>
                         <a:ext uri="{28A0092B-C50C-407E-A947-70E740481C1C}">
                           <a14:useLocalDpi xmlns:a14="http://schemas.microsoft.com/office/drawing/2010/main" val="0"/>
@@ -729,7 +729,7 @@
                     <pic:cNvPicPr/>
                   </pic:nvPicPr>
                   <pic:blipFill>
-                    <a:blip r:embed="rId10">
+                    <a:blip r:embed="rId13">
                       <a:extLst>
                         <a:ext uri="{28A0092B-C50C-407E-A947-70E740481C1C}">
                           <a14:useLocalDpi xmlns:a14="http://schemas.microsoft.com/office/drawing/2010/main" val="0"/>
@@ -898,7 +898,7 @@
                     <pic:cNvPicPr/>
                   </pic:nvPicPr>
                   <pic:blipFill>
-                    <a:blip r:embed="rId11">
+                    <a:blip r:embed="rId14">
                       <a:extLst>
                         <a:ext uri="{28A0092B-C50C-407E-A947-70E740481C1C}">
                           <a14:useLocalDpi xmlns:a14="http://schemas.microsoft.com/office/drawing/2010/main" val="0"/>
@@ -1091,7 +1091,7 @@
                     <pic:cNvPicPr/>
                   </pic:nvPicPr>
                   <pic:blipFill>
-                    <a:blip r:embed="rId12">
+                    <a:blip r:embed="rId15">
                       <a:extLst>
                         <a:ext uri="{28A0092B-C50C-407E-A947-70E740481C1C}">
                           <a14:useLocalDpi xmlns:a14="http://schemas.microsoft.com/office/drawing/2010/main" val="0"/>
@@ -1379,7 +1379,7 @@
                           </pic:cNvPicPr>
                         </pic:nvPicPr>
                         <pic:blipFill rotWithShape="1">
-                          <a:blip r:embed="rId13">
+                          <a:blip r:embed="rId16">
                             <a:extLst>
                               <a:ext uri="{28A0092B-C50C-407E-A947-70E740481C1C}">
                                 <a14:useLocalDpi xmlns:a14="http://schemas.microsoft.com/office/drawing/2010/main" val="0"/>
@@ -1472,7 +1472,7 @@
                   <o:lock v:ext="edit" aspectratio="t"/>
                 </v:shapetype>
                 <v:shape id="図 1" o:spid="_x0000_s1027" type="#_x0000_t75" style="position:absolute;width:22764;height:41903;visibility:visible;mso-wrap-style:square" o:gfxdata="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">
-                  <v:imagedata r:id="rId14" o:title="" croptop="7465f" cropbottom="2088f" cropleft="21039f" cropright="22833f"/>
+                  <v:imagedata r:id="rId17" o:title="" croptop="7465f" cropbottom="2088f" cropleft="21039f" cropright="22833f"/>
                 </v:shape>
                 <v:rect id="正方形/長方形 2" o:spid="_x0000_s1028" style="position:absolute;left:190;width:20955;height:43719;visibility:visible;mso-wrap-style:square;v-text-anchor:middle" o:gfxdata="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" filled="f" strokecolor="#09101d [484]" strokeweight="1pt"/>
               </v:group>
@@ -1602,7 +1602,32 @@
         <w:rPr>
           <w:rFonts w:hint="eastAsia"/>
         </w:rPr>
-        <w:t>(　　　　　)</w:t>
+        <w:t>(</w:t>
+      </w:r>
+      <w:r>
+        <w:rPr>
+          <w:rFonts w:hint="eastAsia"/>
+        </w:rPr>
+        <w:t xml:space="preserve"> </w:t>
+      </w:r>
+      <w:r>
+        <w:rPr>
+          <w:rFonts w:hint="eastAsia"/>
+          <w:color w:val="EE0000"/>
+        </w:rPr>
+        <w:t>スコープ</w:t>
+      </w:r>
+      <w:r>
+        <w:rPr>
+          <w:rFonts w:hint="eastAsia"/>
+        </w:rPr>
+        <w:t xml:space="preserve"> </w:t>
+      </w:r>
+      <w:r>
+        <w:rPr>
+          <w:rFonts w:hint="eastAsia"/>
+        </w:rPr>
+        <w:t>)</w:t>
       </w:r>
       <w:r>
         <w:rPr>
@@ -1632,7 +1657,45 @@
         <w:rPr>
           <w:rFonts w:hint="eastAsia"/>
         </w:rPr>
-        <w:t xml:space="preserve">(　　　　　</w:t>
+        <w:t xml:space="preserve">(　</w:t>
+      </w:r>
+      <w:r>
+        <w:rPr>
+          <w:rFonts w:hint="eastAsia"/>
+          <w:color w:val="EE0000"/>
+        </w:rPr>
+        <w:t>等価演算子</w:t>
+      </w:r>
+      <w:r>
+        <w:rPr>
+          <w:rFonts w:hint="eastAsia"/>
+        </w:rPr>
+        <w:t xml:space="preserve">　)</w:t>
+      </w:r>
+      <w:r>
+        <w:rPr>
+          <w:rFonts w:hint="eastAsia"/>
+        </w:rPr>
+        <w:t>は暗黙の型変換をして比較する演算子であり、</w:t>
+      </w:r>
+      <w:r>
+        <w:rPr>
+          <w:rFonts w:hint="eastAsia"/>
+        </w:rPr>
+        <w:t>型変換をしたくない多くの場合には</w:t>
+      </w:r>
+      <w:r>
+        <w:rPr>
+          <w:rFonts w:hint="eastAsia"/>
+        </w:rPr>
+        <w:t xml:space="preserve">(　</w:t>
+      </w:r>
+      <w:r>
+        <w:rPr>
+          <w:rFonts w:hint="eastAsia"/>
+          <w:color w:val="EE0000"/>
+        </w:rPr>
+        <w:t>厳密等価演算子</w:t>
       </w:r>
       <w:r>
         <w:rPr>
@@ -1644,66 +1707,12 @@
         <w:rPr>
           <w:rFonts w:hint="eastAsia"/>
         </w:rPr>
-        <w:t xml:space="preserve">　</w:t>
-      </w:r>
-      <w:r>
-        <w:rPr>
-          <w:rFonts w:hint="eastAsia"/>
-        </w:rPr>
-        <w:t xml:space="preserve">　</w:t>
-      </w:r>
-      <w:r>
-        <w:rPr>
-          <w:rFonts w:hint="eastAsia"/>
-        </w:rPr>
         <w:t>)</w:t>
       </w:r>
       <w:r>
         <w:rPr>
           <w:rFonts w:hint="eastAsia"/>
         </w:rPr>
-        <w:t>は暗黙の型変換をして比較する演算子であり、</w:t>
-      </w:r>
-      <w:r>
-        <w:rPr>
-          <w:rFonts w:hint="eastAsia"/>
-        </w:rPr>
-        <w:t>型変換をしたくない多くの場合には</w:t>
-      </w:r>
-      <w:r>
-        <w:rPr>
-          <w:rFonts w:hint="eastAsia"/>
-        </w:rPr>
-        <w:t xml:space="preserve">(　　　　</w:t>
-      </w:r>
-      <w:r>
-        <w:rPr>
-          <w:rFonts w:hint="eastAsia"/>
-        </w:rPr>
-        <w:t xml:space="preserve">　</w:t>
-      </w:r>
-      <w:r>
-        <w:rPr>
-          <w:rFonts w:hint="eastAsia"/>
-        </w:rPr>
-        <w:t xml:space="preserve">　</w:t>
-      </w:r>
-      <w:r>
-        <w:rPr>
-          <w:rFonts w:hint="eastAsia"/>
-        </w:rPr>
-        <w:t xml:space="preserve">　　</w:t>
-      </w:r>
-      <w:r>
-        <w:rPr>
-          <w:rFonts w:hint="eastAsia"/>
-        </w:rPr>
-        <w:t>)</w:t>
-      </w:r>
-      <w:r>
-        <w:rPr>
-          <w:rFonts w:hint="eastAsia"/>
-        </w:rPr>
         <w:t>を用いると良い。</w:t>
       </w:r>
     </w:p>
@@ -1728,13 +1737,14 @@
         <w:rPr>
           <w:rFonts w:hint="eastAsia"/>
         </w:rPr>
-        <w:t xml:space="preserve">(　　　　</w:t>
-      </w:r>
-      <w:r>
-        <w:rPr>
-          <w:rFonts w:hint="eastAsia"/>
-        </w:rPr>
-        <w:t xml:space="preserve">　　</w:t>
+        <w:t xml:space="preserve">(　</w:t>
+      </w:r>
+      <w:r>
+        <w:rPr>
+          <w:rFonts w:hint="eastAsia"/>
+          <w:color w:val="EE0000"/>
+        </w:rPr>
+        <w:t>this</w:t>
       </w:r>
       <w:r>
         <w:rPr>
@@ -1770,19 +1780,20 @@
         <w:rPr>
           <w:rFonts w:hint="eastAsia"/>
         </w:rPr>
-        <w:t xml:space="preserve">(　　　</w:t>
-      </w:r>
-      <w:r>
-        <w:rPr>
-          <w:rFonts w:hint="eastAsia"/>
-        </w:rPr>
-        <w:t xml:space="preserve">　　</w:t>
-      </w:r>
-      <w:r>
-        <w:rPr>
-          <w:rFonts w:hint="eastAsia"/>
-        </w:rPr>
-        <w:t xml:space="preserve">　　)</w:t>
+        <w:t xml:space="preserve">(　</w:t>
+      </w:r>
+      <w:r>
+        <w:rPr>
+          <w:rFonts w:hint="eastAsia"/>
+          <w:color w:val="EE0000"/>
+        </w:rPr>
+        <w:t>undefined</w:t>
+      </w:r>
+      <w:r>
+        <w:rPr>
+          <w:rFonts w:hint="eastAsia"/>
+        </w:rPr>
+        <w:t xml:space="preserve">　)</w:t>
       </w:r>
       <w:r>
         <w:rPr>
@@ -1982,6 +1993,24 @@
       </w:r>
     </w:p>
     <w:p>
+      <w:pPr>
+        <w:rPr>
+          <w:rFonts w:hint="eastAsia"/>
+        </w:rPr>
+      </w:pPr>
+      <w:r>
+        <w:tab/>
+      </w:r>
+      <w:r>
+        <w:tab/>
+      </w:r>
+    </w:p>
+    <w:p>
+      <w:pPr>
+        <w:rPr>
+          <w:rFonts w:hint="eastAsia"/>
+        </w:rPr>
+      </w:pPr>
       <w:r>
         <w:t xml:space="preserve">  </w:t>
       </w:r>
@@ -1990,7 +2019,6 @@
         <w:t>}</w:t>
       </w:r>
     </w:p>
-    <w:p/>
     <w:p>
       <w:r>
         <w:t xml:space="preserve">    </w:t>
@@ -3194,7 +3222,7 @@
                     <pic:cNvPicPr/>
                   </pic:nvPicPr>
                   <pic:blipFill>
-                    <a:blip r:embed="rId15">
+                    <a:blip r:embed="rId18">
                       <a:extLst>
                         <a:ext uri="{28A0092B-C50C-407E-A947-70E740481C1C}">
                           <a14:useLocalDpi xmlns:a14="http://schemas.microsoft.com/office/drawing/2010/main" val="0"/>
@@ -3308,7 +3336,7 @@
                     <pic:cNvPicPr/>
                   </pic:nvPicPr>
                   <pic:blipFill>
-                    <a:blip r:embed="rId16">
+                    <a:blip r:embed="rId19">
                       <a:extLst>
                         <a:ext uri="{28A0092B-C50C-407E-A947-70E740481C1C}">
                           <a14:useLocalDpi xmlns:a14="http://schemas.microsoft.com/office/drawing/2010/main" val="0"/>
@@ -3413,7 +3441,7 @@
                     <pic:cNvPicPr/>
                   </pic:nvPicPr>
                   <pic:blipFill>
-                    <a:blip r:embed="rId17">
+                    <a:blip r:embed="rId20">
                       <a:extLst>
                         <a:ext uri="{28A0092B-C50C-407E-A947-70E740481C1C}">
                           <a14:useLocalDpi xmlns:a14="http://schemas.microsoft.com/office/drawing/2010/main" val="0"/>
@@ -3562,7 +3590,7 @@
                     <pic:cNvPicPr/>
                   </pic:nvPicPr>
                   <pic:blipFill>
-                    <a:blip r:embed="rId18">
+                    <a:blip r:embed="rId21">
                       <a:extLst>
                         <a:ext uri="{28A0092B-C50C-407E-A947-70E740481C1C}">
                           <a14:useLocalDpi xmlns:a14="http://schemas.microsoft.com/office/drawing/2010/main" val="0"/>
@@ -3622,7 +3650,7 @@
                     <pic:cNvPicPr/>
                   </pic:nvPicPr>
                   <pic:blipFill>
-                    <a:blip r:embed="rId19">
+                    <a:blip r:embed="rId22">
                       <a:extLst>
                         <a:ext uri="{28A0092B-C50C-407E-A947-70E740481C1C}">
                           <a14:useLocalDpi xmlns:a14="http://schemas.microsoft.com/office/drawing/2010/main" val="0"/>
@@ -3781,7 +3809,7 @@
                     <pic:cNvPicPr/>
                   </pic:nvPicPr>
                   <pic:blipFill>
-                    <a:blip r:embed="rId20">
+                    <a:blip r:embed="rId23">
                       <a:extLst>
                         <a:ext uri="{28A0092B-C50C-407E-A947-70E740481C1C}">
                           <a14:useLocalDpi xmlns:a14="http://schemas.microsoft.com/office/drawing/2010/main" val="0"/>
@@ -3841,7 +3869,7 @@
                     <pic:cNvPicPr/>
                   </pic:nvPicPr>
                   <pic:blipFill>
-                    <a:blip r:embed="rId21">
+                    <a:blip r:embed="rId24">
                       <a:extLst>
                         <a:ext uri="{28A0092B-C50C-407E-A947-70E740481C1C}">
                           <a14:useLocalDpi xmlns:a14="http://schemas.microsoft.com/office/drawing/2010/main" val="0"/>
@@ -3986,7 +4014,7 @@
                     <pic:cNvPicPr/>
                   </pic:nvPicPr>
                   <pic:blipFill>
-                    <a:blip r:embed="rId22">
+                    <a:blip r:embed="rId25">
                       <a:extLst>
                         <a:ext uri="{28A0092B-C50C-407E-A947-70E740481C1C}">
                           <a14:useLocalDpi xmlns:a14="http://schemas.microsoft.com/office/drawing/2010/main" val="0"/>
@@ -4046,7 +4074,7 @@
                     <pic:cNvPicPr/>
                   </pic:nvPicPr>
                   <pic:blipFill>
-                    <a:blip r:embed="rId23">
+                    <a:blip r:embed="rId26">
                       <a:extLst>
                         <a:ext uri="{28A0092B-C50C-407E-A947-70E740481C1C}">
                           <a14:useLocalDpi xmlns:a14="http://schemas.microsoft.com/office/drawing/2010/main" val="0"/>
@@ -4189,7 +4217,7 @@
                     <pic:cNvPicPr/>
                   </pic:nvPicPr>
                   <pic:blipFill>
-                    <a:blip r:embed="rId24">
+                    <a:blip r:embed="rId27">
                       <a:extLst>
                         <a:ext uri="{28A0092B-C50C-407E-A947-70E740481C1C}">
                           <a14:useLocalDpi xmlns:a14="http://schemas.microsoft.com/office/drawing/2010/main" val="0"/>
@@ -4249,7 +4277,7 @@
                     <pic:cNvPicPr/>
                   </pic:nvPicPr>
                   <pic:blipFill>
-                    <a:blip r:embed="rId25">
+                    <a:blip r:embed="rId28">
                       <a:extLst>
                         <a:ext uri="{28A0092B-C50C-407E-A947-70E740481C1C}">
                           <a14:useLocalDpi xmlns:a14="http://schemas.microsoft.com/office/drawing/2010/main" val="0"/>
@@ -4774,7 +4802,7 @@
                     <pic:cNvPicPr/>
                   </pic:nvPicPr>
                   <pic:blipFill>
-                    <a:blip r:embed="rId26">
+                    <a:blip r:embed="rId29">
                       <a:extLst>
                         <a:ext uri="{28A0092B-C50C-407E-A947-70E740481C1C}">
                           <a14:useLocalDpi xmlns:a14="http://schemas.microsoft.com/office/drawing/2010/main" val="0"/>
@@ -4903,8 +4931,8 @@
     <w:p/>
     <w:p/>
     <w:sectPr>
-      <w:headerReference w:type="default" r:id="rId27"/>
-      <w:footerReference w:type="default" r:id="rId28"/>
+      <w:headerReference w:type="default" r:id="rId30"/>
+      <w:footerReference w:type="default" r:id="rId31"/>
       <w:pgSz w:w="11906" w:h="16838"/>
       <w:pgMar w:top="1985" w:right="1701" w:bottom="1701" w:left="1701" w:header="851" w:footer="992" w:gutter="0"/>
       <w:pgNumType w:fmt="numberInDash"/>
@@ -4916,7 +4944,7 @@
 </file>
 
 <file path=word/endnotes.xml><?xml version="1.0" encoding="utf-8"?>
-<w:endnotes xmlns:wpc="http://schemas.microsoft.com/office/word/2010/wordprocessingCanvas" xmlns:cx="http://schemas.microsoft.com/office/drawing/2014/chartex" xmlns:cx1="http://schemas.microsoft.com/office/drawing/2015/9/8/chartex" xmlns:cx2="http://schemas.microsoft.com/office/drawing/2015/10/21/chartex" xmlns:cx3="http://schemas.microsoft.com/office/drawing/2016/5/9/chartex" xmlns:cx4="http://schemas.microsoft.com/office/drawing/2016/5/10/chartex" xmlns:cx5="http://schemas.microsoft.com/office/drawing/2016/5/11/chartex" xmlns:cx6="http://schemas.microsoft.com/office/drawing/2016/5/12/chartex" xmlns:cx7="http://schemas.microsoft.com/office/drawing/2016/5/13/chartex" xmlns:cx8="http://schemas.microsoft.com/office/drawing/2016/5/14/chartex" xmlns:mc="http://schemas.openxmlformats.org/markup-compatibility/2006" xmlns:aink="http://schemas.microsoft.com/office/drawing/2016/ink" xmlns:am3d="http://schemas.microsoft.com/office/drawing/2017/model3d" xmlns:o="urn:schemas-microsoft-com:office:office" xmlns:oel="http://schemas.microsoft.com/office/2019/extlst" xmlns:r="http://schemas.openxmlformats.org/officeDocument/2006/relationships" xmlns:m="http://schemas.openxmlformats.org/officeDocument/2006/math" xmlns:v="urn:schemas-microsoft-com:vml" xmlns:wp14="http://schemas.microsoft.com/office/word/2010/wordprocessingDrawing" xmlns:wp="http://schemas.openxmlformats.org/drawingml/2006/wordprocessingDrawing" xmlns:w10="urn:schemas-microsoft-com:office:word" xmlns:w="http://schemas.openxmlformats.org/wordprocessingml/2006/main" xmlns:w14="http://schemas.microsoft.com/office/word/2010/wordml" xmlns:w15="http://schemas.microsoft.com/office/word/2012/wordml" xmlns:w16cex="http://schemas.microsoft.com/office/word/2018/wordml/cex" xmlns:w16cid="http://schemas.microsoft.com/office/word/2016/wordml/cid" xmlns:w16="http://schemas.microsoft.com/office/word/2018/wordml" xmlns:w16sdtdh="http://schemas.microsoft.com/office/word/2020/wordml/sdtdatahash" xmlns:w16se="http://schemas.microsoft.com/office/word/2015/wordml/symex" xmlns:wpg="http://schemas.microsoft.com/office/word/2010/wordprocessingGroup" xmlns:wpi="http://schemas.microsoft.com/office/word/2010/wordprocessingInk" xmlns:wne="http://schemas.microsoft.com/office/word/2006/wordml" xmlns:wps="http://schemas.microsoft.com/office/word/2010/wordprocessingShape" mc:Ignorable="w14 w15 w16se w16cid w16 w16cex w16sdtdh wp14">
+<w:endnotes xmlns:wpc="http://schemas.microsoft.com/office/word/2010/wordprocessingCanvas" xmlns:cx="http://schemas.microsoft.com/office/drawing/2014/chartex" xmlns:cx1="http://schemas.microsoft.com/office/drawing/2015/9/8/chartex" xmlns:cx2="http://schemas.microsoft.com/office/drawing/2015/10/21/chartex" xmlns:cx3="http://schemas.microsoft.com/office/drawing/2016/5/9/chartex" xmlns:cx4="http://schemas.microsoft.com/office/drawing/2016/5/10/chartex" xmlns:cx5="http://schemas.microsoft.com/office/drawing/2016/5/11/chartex" xmlns:cx6="http://schemas.microsoft.com/office/drawing/2016/5/12/chartex" xmlns:cx7="http://schemas.microsoft.com/office/drawing/2016/5/13/chartex" xmlns:cx8="http://schemas.microsoft.com/office/drawing/2016/5/14/chartex" xmlns:mc="http://schemas.openxmlformats.org/markup-compatibility/2006" xmlns:aink="http://schemas.microsoft.com/office/drawing/2016/ink" xmlns:am3d="http://schemas.microsoft.com/office/drawing/2017/model3d" xmlns:o="urn:schemas-microsoft-com:office:office" xmlns:oel="http://schemas.microsoft.com/office/2019/extlst" xmlns:r="http://schemas.openxmlformats.org/officeDocument/2006/relationships" xmlns:m="http://schemas.openxmlformats.org/officeDocument/2006/math" xmlns:v="urn:schemas-microsoft-com:vml" xmlns:wp14="http://schemas.microsoft.com/office/word/2010/wordprocessingDrawing" xmlns:wp="http://schemas.openxmlformats.org/drawingml/2006/wordprocessingDrawing" xmlns:w10="urn:schemas-microsoft-com:office:word" xmlns:w="http://schemas.openxmlformats.org/wordprocessingml/2006/main" xmlns:w14="http://schemas.microsoft.com/office/word/2010/wordml" xmlns:w15="http://schemas.microsoft.com/office/word/2012/wordml" xmlns:w16cex="http://schemas.microsoft.com/office/word/2018/wordml/cex" xmlns:w16cid="http://schemas.microsoft.com/office/word/2016/wordml/cid" xmlns:w16="http://schemas.microsoft.com/office/word/2018/wordml" xmlns:w16du="http://schemas.microsoft.com/office/word/2023/wordml/word16du" xmlns:w16sdtdh="http://schemas.microsoft.com/office/word/2020/wordml/sdtdatahash" xmlns:w16sdtfl="http://schemas.microsoft.com/office/word/2024/wordml/sdtformatlock" xmlns:w16se="http://schemas.microsoft.com/office/word/2015/wordml/symex" xmlns:wpg="http://schemas.microsoft.com/office/word/2010/wordprocessingGroup" xmlns:wpi="http://schemas.microsoft.com/office/word/2010/wordprocessingInk" xmlns:wne="http://schemas.microsoft.com/office/word/2006/wordml" xmlns:wps="http://schemas.microsoft.com/office/word/2010/wordprocessingShape" mc:Ignorable="w14 w15 w16se w16cid w16 w16cex w16sdtdh w16sdtfl w16du wp14">
   <w:endnote w:type="separator" w:id="-1">
     <w:p>
       <w:r>
@@ -4935,7 +4963,7 @@
 </file>
 
 <file path=word/footer1.xml><?xml version="1.0" encoding="utf-8"?>
-<w:ftr xmlns:wpc="http://schemas.microsoft.com/office/word/2010/wordprocessingCanvas" xmlns:cx="http://schemas.microsoft.com/office/drawing/2014/chartex" xmlns:cx1="http://schemas.microsoft.com/office/drawing/2015/9/8/chartex" xmlns:cx2="http://schemas.microsoft.com/office/drawing/2015/10/21/chartex" xmlns:cx3="http://schemas.microsoft.com/office/drawing/2016/5/9/chartex" xmlns:cx4="http://schemas.microsoft.com/office/drawing/2016/5/10/chartex" xmlns:cx5="http://schemas.microsoft.com/office/drawing/2016/5/11/chartex" xmlns:cx6="http://schemas.microsoft.com/office/drawing/2016/5/12/chartex" xmlns:cx7="http://schemas.microsoft.com/office/drawing/2016/5/13/chartex" xmlns:cx8="http://schemas.microsoft.com/office/drawing/2016/5/14/chartex" xmlns:mc="http://schemas.openxmlformats.org/markup-compatibility/2006" xmlns:aink="http://schemas.microsoft.com/office/drawing/2016/ink" xmlns:am3d="http://schemas.microsoft.com/office/drawing/2017/model3d" xmlns:o="urn:schemas-microsoft-com:office:office" xmlns:oel="http://schemas.microsoft.com/office/2019/extlst" xmlns:r="http://schemas.openxmlformats.org/officeDocument/2006/relationships" xmlns:m="http://schemas.openxmlformats.org/officeDocument/2006/math" xmlns:v="urn:schemas-microsoft-com:vml" xmlns:wp14="http://schemas.microsoft.com/office/word/2010/wordprocessingDrawing" xmlns:wp="http://schemas.openxmlformats.org/drawingml/2006/wordprocessingDrawing" xmlns:w10="urn:schemas-microsoft-com:office:word" xmlns:w="http://schemas.openxmlformats.org/wordprocessingml/2006/main" xmlns:w14="http://schemas.microsoft.com/office/word/2010/wordml" xmlns:w15="http://schemas.microsoft.com/office/word/2012/wordml" xmlns:w16cex="http://schemas.microsoft.com/office/word/2018/wordml/cex" xmlns:w16cid="http://schemas.microsoft.com/office/word/2016/wordml/cid" xmlns:w16="http://schemas.microsoft.com/office/word/2018/wordml" xmlns:w16sdtdh="http://schemas.microsoft.com/office/word/2020/wordml/sdtdatahash" xmlns:w16se="http://schemas.microsoft.com/office/word/2015/wordml/symex" xmlns:wpg="http://schemas.microsoft.com/office/word/2010/wordprocessingGroup" xmlns:wpi="http://schemas.microsoft.com/office/word/2010/wordprocessingInk" xmlns:wne="http://schemas.microsoft.com/office/word/2006/wordml" xmlns:wps="http://schemas.microsoft.com/office/word/2010/wordprocessingShape" mc:Ignorable="w14 w15 w16se w16cid w16 w16cex w16sdtdh wp14">
+<w:ftr xmlns:wpc="http://schemas.microsoft.com/office/word/2010/wordprocessingCanvas" xmlns:cx="http://schemas.microsoft.com/office/drawing/2014/chartex" xmlns:cx1="http://schemas.microsoft.com/office/drawing/2015/9/8/chartex" xmlns:cx2="http://schemas.microsoft.com/office/drawing/2015/10/21/chartex" xmlns:cx3="http://schemas.microsoft.com/office/drawing/2016/5/9/chartex" xmlns:cx4="http://schemas.microsoft.com/office/drawing/2016/5/10/chartex" xmlns:cx5="http://schemas.microsoft.com/office/drawing/2016/5/11/chartex" xmlns:cx6="http://schemas.microsoft.com/office/drawing/2016/5/12/chartex" xmlns:cx7="http://schemas.microsoft.com/office/drawing/2016/5/13/chartex" xmlns:cx8="http://schemas.microsoft.com/office/drawing/2016/5/14/chartex" xmlns:mc="http://schemas.openxmlformats.org/markup-compatibility/2006" xmlns:aink="http://schemas.microsoft.com/office/drawing/2016/ink" xmlns:am3d="http://schemas.microsoft.com/office/drawing/2017/model3d" xmlns:o="urn:schemas-microsoft-com:office:office" xmlns:oel="http://schemas.microsoft.com/office/2019/extlst" xmlns:r="http://schemas.openxmlformats.org/officeDocument/2006/relationships" xmlns:m="http://schemas.openxmlformats.org/officeDocument/2006/math" xmlns:v="urn:schemas-microsoft-com:vml" xmlns:wp14="http://schemas.microsoft.com/office/word/2010/wordprocessingDrawing" xmlns:wp="http://schemas.openxmlformats.org/drawingml/2006/wordprocessingDrawing" xmlns:w10="urn:schemas-microsoft-com:office:word" xmlns:w="http://schemas.openxmlformats.org/wordprocessingml/2006/main" xmlns:w14="http://schemas.microsoft.com/office/word/2010/wordml" xmlns:w15="http://schemas.microsoft.com/office/word/2012/wordml" xmlns:w16cex="http://schemas.microsoft.com/office/word/2018/wordml/cex" xmlns:w16cid="http://schemas.microsoft.com/office/word/2016/wordml/cid" xmlns:w16="http://schemas.microsoft.com/office/word/2018/wordml" xmlns:w16du="http://schemas.microsoft.com/office/word/2023/wordml/word16du" xmlns:w16sdtdh="http://schemas.microsoft.com/office/word/2020/wordml/sdtdatahash" xmlns:w16sdtfl="http://schemas.microsoft.com/office/word/2024/wordml/sdtformatlock" xmlns:w16se="http://schemas.microsoft.com/office/word/2015/wordml/symex" xmlns:wpg="http://schemas.microsoft.com/office/word/2010/wordprocessingGroup" xmlns:wpi="http://schemas.microsoft.com/office/word/2010/wordprocessingInk" xmlns:wne="http://schemas.microsoft.com/office/word/2006/wordml" xmlns:wps="http://schemas.microsoft.com/office/word/2010/wordprocessingShape" mc:Ignorable="w14 w15 w16se w16cid w16 w16cex w16sdtdh w16sdtfl w16du wp14">
   <w:sdt>
     <w:sdtPr>
       <w:id w:val="-1355114770"/>
@@ -4980,7 +5008,7 @@
 </file>
 
 <file path=word/footnotes.xml><?xml version="1.0" encoding="utf-8"?>
-<w:footnotes xmlns:wpc="http://schemas.microsoft.com/office/word/2010/wordprocessingCanvas" xmlns:cx="http://schemas.microsoft.com/office/drawing/2014/chartex" xmlns:cx1="http://schemas.microsoft.com/office/drawing/2015/9/8/chartex" xmlns:cx2="http://schemas.microsoft.com/office/drawing/2015/10/21/chartex" xmlns:cx3="http://schemas.microsoft.com/office/drawing/2016/5/9/chartex" xmlns:cx4="http://schemas.microsoft.com/office/drawing/2016/5/10/chartex" xmlns:cx5="http://schemas.microsoft.com/office/drawing/2016/5/11/chartex" xmlns:cx6="http://schemas.microsoft.com/office/drawing/2016/5/12/chartex" xmlns:cx7="http://schemas.microsoft.com/office/drawing/2016/5/13/chartex" xmlns:cx8="http://schemas.microsoft.com/office/drawing/2016/5/14/chartex" xmlns:mc="http://schemas.openxmlformats.org/markup-compatibility/2006" xmlns:aink="http://schemas.microsoft.com/office/drawing/2016/ink" xmlns:am3d="http://schemas.microsoft.com/office/drawing/2017/model3d" xmlns:o="urn:schemas-microsoft-com:office:office" xmlns:oel="http://schemas.microsoft.com/office/2019/extlst" xmlns:r="http://schemas.openxmlformats.org/officeDocument/2006/relationships" xmlns:m="http://schemas.openxmlformats.org/officeDocument/2006/math" xmlns:v="urn:schemas-microsoft-com:vml" xmlns:wp14="http://schemas.microsoft.com/office/word/2010/wordprocessingDrawing" xmlns:wp="http://schemas.openxmlformats.org/drawingml/2006/wordprocessingDrawing" xmlns:w10="urn:schemas-microsoft-com:office:word" xmlns:w="http://schemas.openxmlformats.org/wordprocessingml/2006/main" xmlns:w14="http://schemas.microsoft.com/office/word/2010/wordml" xmlns:w15="http://schemas.microsoft.com/office/word/2012/wordml" xmlns:w16cex="http://schemas.microsoft.com/office/word/2018/wordml/cex" xmlns:w16cid="http://schemas.microsoft.com/office/word/2016/wordml/cid" xmlns:w16="http://schemas.microsoft.com/office/word/2018/wordml" xmlns:w16sdtdh="http://schemas.microsoft.com/office/word/2020/wordml/sdtdatahash" xmlns:w16se="http://schemas.microsoft.com/office/word/2015/wordml/symex" xmlns:wpg="http://schemas.microsoft.com/office/word/2010/wordprocessingGroup" xmlns:wpi="http://schemas.microsoft.com/office/word/2010/wordprocessingInk" xmlns:wne="http://schemas.microsoft.com/office/word/2006/wordml" xmlns:wps="http://schemas.microsoft.com/office/word/2010/wordprocessingShape" mc:Ignorable="w14 w15 w16se w16cid w16 w16cex w16sdtdh wp14">
+<w:footnotes xmlns:wpc="http://schemas.microsoft.com/office/word/2010/wordprocessingCanvas" xmlns:cx="http://schemas.microsoft.com/office/drawing/2014/chartex" xmlns:cx1="http://schemas.microsoft.com/office/drawing/2015/9/8/chartex" xmlns:cx2="http://schemas.microsoft.com/office/drawing/2015/10/21/chartex" xmlns:cx3="http://schemas.microsoft.com/office/drawing/2016/5/9/chartex" xmlns:cx4="http://schemas.microsoft.com/office/drawing/2016/5/10/chartex" xmlns:cx5="http://schemas.microsoft.com/office/drawing/2016/5/11/chartex" xmlns:cx6="http://schemas.microsoft.com/office/drawing/2016/5/12/chartex" xmlns:cx7="http://schemas.microsoft.com/office/drawing/2016/5/13/chartex" xmlns:cx8="http://schemas.microsoft.com/office/drawing/2016/5/14/chartex" xmlns:mc="http://schemas.openxmlformats.org/markup-compatibility/2006" xmlns:aink="http://schemas.microsoft.com/office/drawing/2016/ink" xmlns:am3d="http://schemas.microsoft.com/office/drawing/2017/model3d" xmlns:o="urn:schemas-microsoft-com:office:office" xmlns:oel="http://schemas.microsoft.com/office/2019/extlst" xmlns:r="http://schemas.openxmlformats.org/officeDocument/2006/relationships" xmlns:m="http://schemas.openxmlformats.org/officeDocument/2006/math" xmlns:v="urn:schemas-microsoft-com:vml" xmlns:wp14="http://schemas.microsoft.com/office/word/2010/wordprocessingDrawing" xmlns:wp="http://schemas.openxmlformats.org/drawingml/2006/wordprocessingDrawing" xmlns:w10="urn:schemas-microsoft-com:office:word" xmlns:w="http://schemas.openxmlformats.org/wordprocessingml/2006/main" xmlns:w14="http://schemas.microsoft.com/office/word/2010/wordml" xmlns:w15="http://schemas.microsoft.com/office/word/2012/wordml" xmlns:w16cex="http://schemas.microsoft.com/office/word/2018/wordml/cex" xmlns:w16cid="http://schemas.microsoft.com/office/word/2016/wordml/cid" xmlns:w16="http://schemas.microsoft.com/office/word/2018/wordml" xmlns:w16du="http://schemas.microsoft.com/office/word/2023/wordml/word16du" xmlns:w16sdtdh="http://schemas.microsoft.com/office/word/2020/wordml/sdtdatahash" xmlns:w16sdtfl="http://schemas.microsoft.com/office/word/2024/wordml/sdtformatlock" xmlns:w16se="http://schemas.microsoft.com/office/word/2015/wordml/symex" xmlns:wpg="http://schemas.microsoft.com/office/word/2010/wordprocessingGroup" xmlns:wpi="http://schemas.microsoft.com/office/word/2010/wordprocessingInk" xmlns:wne="http://schemas.microsoft.com/office/word/2006/wordml" xmlns:wps="http://schemas.microsoft.com/office/word/2010/wordprocessingShape" mc:Ignorable="w14 w15 w16se w16cid w16 w16cex w16sdtdh w16sdtfl w16du wp14">
   <w:footnote w:type="separator" w:id="-1">
     <w:p>
       <w:r>
@@ -4999,7 +5027,7 @@
 </file>
 
 <file path=word/header1.xml><?xml version="1.0" encoding="utf-8"?>
-<w:hdr xmlns:wpc="http://schemas.microsoft.com/office/word/2010/wordprocessingCanvas" xmlns:cx="http://schemas.microsoft.com/office/drawing/2014/chartex" xmlns:cx1="http://schemas.microsoft.com/office/drawing/2015/9/8/chartex" xmlns:cx2="http://schemas.microsoft.com/office/drawing/2015/10/21/chartex" xmlns:cx3="http://schemas.microsoft.com/office/drawing/2016/5/9/chartex" xmlns:cx4="http://schemas.microsoft.com/office/drawing/2016/5/10/chartex" xmlns:cx5="http://schemas.microsoft.com/office/drawing/2016/5/11/chartex" xmlns:cx6="http://schemas.microsoft.com/office/drawing/2016/5/12/chartex" xmlns:cx7="http://schemas.microsoft.com/office/drawing/2016/5/13/chartex" xmlns:cx8="http://schemas.microsoft.com/office/drawing/2016/5/14/chartex" xmlns:mc="http://schemas.openxmlformats.org/markup-compatibility/2006" xmlns:aink="http://schemas.microsoft.com/office/drawing/2016/ink" xmlns:am3d="http://schemas.microsoft.com/office/drawing/2017/model3d" xmlns:o="urn:schemas-microsoft-com:office:office" xmlns:oel="http://schemas.microsoft.com/office/2019/extlst" xmlns:r="http://schemas.openxmlformats.org/officeDocument/2006/relationships" xmlns:m="http://schemas.openxmlformats.org/officeDocument/2006/math" xmlns:v="urn:schemas-microsoft-com:vml" xmlns:wp14="http://schemas.microsoft.com/office/word/2010/wordprocessingDrawing" xmlns:wp="http://schemas.openxmlformats.org/drawingml/2006/wordprocessingDrawing" xmlns:w10="urn:schemas-microsoft-com:office:word" xmlns:w="http://schemas.openxmlformats.org/wordprocessingml/2006/main" xmlns:w14="http://schemas.microsoft.com/office/word/2010/wordml" xmlns:w15="http://schemas.microsoft.com/office/word/2012/wordml" xmlns:w16cex="http://schemas.microsoft.com/office/word/2018/wordml/cex" xmlns:w16cid="http://schemas.microsoft.com/office/word/2016/wordml/cid" xmlns:w16="http://schemas.microsoft.com/office/word/2018/wordml" xmlns:w16sdtdh="http://schemas.microsoft.com/office/word/2020/wordml/sdtdatahash" xmlns:w16se="http://schemas.microsoft.com/office/word/2015/wordml/symex" xmlns:wpg="http://schemas.microsoft.com/office/word/2010/wordprocessingGroup" xmlns:wpi="http://schemas.microsoft.com/office/word/2010/wordprocessingInk" xmlns:wne="http://schemas.microsoft.com/office/word/2006/wordml" xmlns:wps="http://schemas.microsoft.com/office/word/2010/wordprocessingShape" mc:Ignorable="w14 w15 w16se w16cid w16 w16cex w16sdtdh wp14">
+<w:hdr xmlns:wpc="http://schemas.microsoft.com/office/word/2010/wordprocessingCanvas" xmlns:cx="http://schemas.microsoft.com/office/drawing/2014/chartex" xmlns:cx1="http://schemas.microsoft.com/office/drawing/2015/9/8/chartex" xmlns:cx2="http://schemas.microsoft.com/office/drawing/2015/10/21/chartex" xmlns:cx3="http://schemas.microsoft.com/office/drawing/2016/5/9/chartex" xmlns:cx4="http://schemas.microsoft.com/office/drawing/2016/5/10/chartex" xmlns:cx5="http://schemas.microsoft.com/office/drawing/2016/5/11/chartex" xmlns:cx6="http://schemas.microsoft.com/office/drawing/2016/5/12/chartex" xmlns:cx7="http://schemas.microsoft.com/office/drawing/2016/5/13/chartex" xmlns:cx8="http://schemas.microsoft.com/office/drawing/2016/5/14/chartex" xmlns:mc="http://schemas.openxmlformats.org/markup-compatibility/2006" xmlns:aink="http://schemas.microsoft.com/office/drawing/2016/ink" xmlns:am3d="http://schemas.microsoft.com/office/drawing/2017/model3d" xmlns:o="urn:schemas-microsoft-com:office:office" xmlns:oel="http://schemas.microsoft.com/office/2019/extlst" xmlns:r="http://schemas.openxmlformats.org/officeDocument/2006/relationships" xmlns:m="http://schemas.openxmlformats.org/officeDocument/2006/math" xmlns:v="urn:schemas-microsoft-com:vml" xmlns:wp14="http://schemas.microsoft.com/office/word/2010/wordprocessingDrawing" xmlns:wp="http://schemas.openxmlformats.org/drawingml/2006/wordprocessingDrawing" xmlns:w10="urn:schemas-microsoft-com:office:word" xmlns:w="http://schemas.openxmlformats.org/wordprocessingml/2006/main" xmlns:w14="http://schemas.microsoft.com/office/word/2010/wordml" xmlns:w15="http://schemas.microsoft.com/office/word/2012/wordml" xmlns:w16cex="http://schemas.microsoft.com/office/word/2018/wordml/cex" xmlns:w16cid="http://schemas.microsoft.com/office/word/2016/wordml/cid" xmlns:w16="http://schemas.microsoft.com/office/word/2018/wordml" xmlns:w16du="http://schemas.microsoft.com/office/word/2023/wordml/word16du" xmlns:w16sdtdh="http://schemas.microsoft.com/office/word/2020/wordml/sdtdatahash" xmlns:w16sdtfl="http://schemas.microsoft.com/office/word/2024/wordml/sdtformatlock" xmlns:w16se="http://schemas.microsoft.com/office/word/2015/wordml/symex" xmlns:wpg="http://schemas.microsoft.com/office/word/2010/wordprocessingGroup" xmlns:wpi="http://schemas.microsoft.com/office/word/2010/wordprocessingInk" xmlns:wne="http://schemas.microsoft.com/office/word/2006/wordml" xmlns:wps="http://schemas.microsoft.com/office/word/2010/wordprocessingShape" mc:Ignorable="w14 w15 w16se w16cid w16 w16cex w16sdtdh w16sdtfl w16du wp14">
   <w:p>
     <w:pPr>
       <w:pStyle w:val="a5"/>
@@ -5015,7 +5043,7 @@
 </file>
 
 <file path=word/numbering.xml><?xml version="1.0" encoding="utf-8"?>
-<w:numbering xmlns:wpc="http://schemas.microsoft.com/office/word/2010/wordprocessingCanvas" xmlns:cx="http://schemas.microsoft.com/office/drawing/2014/chartex" xmlns:cx1="http://schemas.microsoft.com/office/drawing/2015/9/8/chartex" xmlns:cx2="http://schemas.microsoft.com/office/drawing/2015/10/21/chartex" xmlns:cx3="http://schemas.microsoft.com/office/drawing/2016/5/9/chartex" xmlns:cx4="http://schemas.microsoft.com/office/drawing/2016/5/10/chartex" xmlns:cx5="http://schemas.microsoft.com/office/drawing/2016/5/11/chartex" xmlns:cx6="http://schemas.microsoft.com/office/drawing/2016/5/12/chartex" xmlns:cx7="http://schemas.microsoft.com/office/drawing/2016/5/13/chartex" xmlns:cx8="http://schemas.microsoft.com/office/drawing/2016/5/14/chartex" xmlns:mc="http://schemas.openxmlformats.org/markup-compatibility/2006" xmlns:aink="http://schemas.microsoft.com/office/drawing/2016/ink" xmlns:am3d="http://schemas.microsoft.com/office/drawing/2017/model3d" xmlns:o="urn:schemas-microsoft-com:office:office" xmlns:oel="http://schemas.microsoft.com/office/2019/extlst" xmlns:r="http://schemas.openxmlformats.org/officeDocument/2006/relationships" xmlns:m="http://schemas.openxmlformats.org/officeDocument/2006/math" xmlns:v="urn:schemas-microsoft-com:vml" xmlns:wp14="http://schemas.microsoft.com/office/word/2010/wordprocessingDrawing" xmlns:wp="http://schemas.openxmlformats.org/drawingml/2006/wordprocessingDrawing" xmlns:w10="urn:schemas-microsoft-com:office:word" xmlns:w="http://schemas.openxmlformats.org/wordprocessingml/2006/main" xmlns:w14="http://schemas.microsoft.com/office/word/2010/wordml" xmlns:w15="http://schemas.microsoft.com/office/word/2012/wordml" xmlns:w16cex="http://schemas.microsoft.com/office/word/2018/wordml/cex" xmlns:w16cid="http://schemas.microsoft.com/office/word/2016/wordml/cid" xmlns:w16="http://schemas.microsoft.com/office/word/2018/wordml" xmlns:w16sdtdh="http://schemas.microsoft.com/office/word/2020/wordml/sdtdatahash" xmlns:w16se="http://schemas.microsoft.com/office/word/2015/wordml/symex" xmlns:wpg="http://schemas.microsoft.com/office/word/2010/wordprocessingGroup" xmlns:wpi="http://schemas.microsoft.com/office/word/2010/wordprocessingInk" xmlns:wne="http://schemas.microsoft.com/office/word/2006/wordml" xmlns:wps="http://schemas.microsoft.com/office/word/2010/wordprocessingShape" mc:Ignorable="w14 w15 w16se w16cid w16 w16cex w16sdtdh wp14">
+<w:numbering xmlns:wpc="http://schemas.microsoft.com/office/word/2010/wordprocessingCanvas" xmlns:cx="http://schemas.microsoft.com/office/drawing/2014/chartex" xmlns:cx1="http://schemas.microsoft.com/office/drawing/2015/9/8/chartex" xmlns:cx2="http://schemas.microsoft.com/office/drawing/2015/10/21/chartex" xmlns:cx3="http://schemas.microsoft.com/office/drawing/2016/5/9/chartex" xmlns:cx4="http://schemas.microsoft.com/office/drawing/2016/5/10/chartex" xmlns:cx5="http://schemas.microsoft.com/office/drawing/2016/5/11/chartex" xmlns:cx6="http://schemas.microsoft.com/office/drawing/2016/5/12/chartex" xmlns:cx7="http://schemas.microsoft.com/office/drawing/2016/5/13/chartex" xmlns:cx8="http://schemas.microsoft.com/office/drawing/2016/5/14/chartex" xmlns:mc="http://schemas.openxmlformats.org/markup-compatibility/2006" xmlns:aink="http://schemas.microsoft.com/office/drawing/2016/ink" xmlns:am3d="http://schemas.microsoft.com/office/drawing/2017/model3d" xmlns:o="urn:schemas-microsoft-com:office:office" xmlns:oel="http://schemas.microsoft.com/office/2019/extlst" xmlns:r="http://schemas.openxmlformats.org/officeDocument/2006/relationships" xmlns:m="http://schemas.openxmlformats.org/officeDocument/2006/math" xmlns:v="urn:schemas-microsoft-com:vml" xmlns:wp14="http://schemas.microsoft.com/office/word/2010/wordprocessingDrawing" xmlns:wp="http://schemas.openxmlformats.org/drawingml/2006/wordprocessingDrawing" xmlns:w10="urn:schemas-microsoft-com:office:word" xmlns:w="http://schemas.openxmlformats.org/wordprocessingml/2006/main" xmlns:w14="http://schemas.microsoft.com/office/word/2010/wordml" xmlns:w15="http://schemas.microsoft.com/office/word/2012/wordml" xmlns:w16cex="http://schemas.microsoft.com/office/word/2018/wordml/cex" xmlns:w16cid="http://schemas.microsoft.com/office/word/2016/wordml/cid" xmlns:w16="http://schemas.microsoft.com/office/word/2018/wordml" xmlns:w16du="http://schemas.microsoft.com/office/word/2023/wordml/word16du" xmlns:w16sdtdh="http://schemas.microsoft.com/office/word/2020/wordml/sdtdatahash" xmlns:w16sdtfl="http://schemas.microsoft.com/office/word/2024/wordml/sdtformatlock" xmlns:w16se="http://schemas.microsoft.com/office/word/2015/wordml/symex" xmlns:wpg="http://schemas.microsoft.com/office/word/2010/wordprocessingGroup" xmlns:wpi="http://schemas.microsoft.com/office/word/2010/wordprocessingInk" xmlns:wne="http://schemas.microsoft.com/office/word/2006/wordml" xmlns:wps="http://schemas.microsoft.com/office/word/2010/wordprocessingShape" mc:Ignorable="w14 w15 w16se w16cid w16 w16cex w16sdtdh w16sdtfl w16du wp14">
   <w:abstractNum w:abstractNumId="0" w15:restartNumberingAfterBreak="0">
     <w:nsid w:val="0CE30F56"/>
     <w:multiLevelType w:val="hybridMultilevel"/>
@@ -5528,7 +5556,7 @@
 </file>
 
 <file path=word/styles.xml><?xml version="1.0" encoding="utf-8"?>
-<w:styles xmlns:mc="http://schemas.openxmlformats.org/markup-compatibility/2006" xmlns:r="http://schemas.openxmlformats.org/officeDocument/2006/relationships" xmlns:w="http://schemas.openxmlformats.org/wordprocessingml/2006/main" xmlns:w14="http://schemas.microsoft.com/office/word/2010/wordml" xmlns:w15="http://schemas.microsoft.com/office/word/2012/wordml" xmlns:w16cex="http://schemas.microsoft.com/office/word/2018/wordml/cex" xmlns:w16cid="http://schemas.microsoft.com/office/word/2016/wordml/cid" xmlns:w16="http://schemas.microsoft.com/office/word/2018/wordml" xmlns:w16sdtdh="http://schemas.microsoft.com/office/word/2020/wordml/sdtdatahash" xmlns:w16se="http://schemas.microsoft.com/office/word/2015/wordml/symex" mc:Ignorable="w14 w15 w16se w16cid w16 w16cex w16sdtdh">
+<w:styles xmlns:mc="http://schemas.openxmlformats.org/markup-compatibility/2006" xmlns:r="http://schemas.openxmlformats.org/officeDocument/2006/relationships" xmlns:w="http://schemas.openxmlformats.org/wordprocessingml/2006/main" xmlns:w14="http://schemas.microsoft.com/office/word/2010/wordml" xmlns:w15="http://schemas.microsoft.com/office/word/2012/wordml" xmlns:w16cex="http://schemas.microsoft.com/office/word/2018/wordml/cex" xmlns:w16cid="http://schemas.microsoft.com/office/word/2016/wordml/cid" xmlns:w16="http://schemas.microsoft.com/office/word/2018/wordml" xmlns:w16du="http://schemas.microsoft.com/office/word/2023/wordml/word16du" xmlns:w16sdtdh="http://schemas.microsoft.com/office/word/2020/wordml/sdtdatahash" xmlns:w16sdtfl="http://schemas.microsoft.com/office/word/2024/wordml/sdtformatlock" xmlns:w16se="http://schemas.microsoft.com/office/word/2015/wordml/symex" mc:Ignorable="w14 w15 w16se w16cid w16 w16cex w16sdtdh w16sdtfl w16du">
   <w:docDefaults>
     <w:rPrDefault>
       <w:rPr>
@@ -6474,10 +6502,75 @@
 </file>
 
 <file path=customXml/item1.xml><?xml version="1.0" encoding="utf-8"?>
+<p:properties xmlns:p="http://schemas.microsoft.com/office/2006/metadata/properties" xmlns:xsi="http://www.w3.org/2001/XMLSchema-instance" xmlns:pc="http://schemas.microsoft.com/office/infopath/2007/PartnerControls">
+  <documentManagement>
+    <LMS_Mappings xmlns="88cc3c26-756f-41ab-80ed-43e7289fee5b" xsi:nil="true"/>
+    <Is_Collaboration_Space_Locked xmlns="88cc3c26-756f-41ab-80ed-43e7289fee5b" xsi:nil="true"/>
+    <Has_Teacher_Only_SectionGroup xmlns="88cc3c26-756f-41ab-80ed-43e7289fee5b" xsi:nil="true"/>
+    <FolderType xmlns="88cc3c26-756f-41ab-80ed-43e7289fee5b" xsi:nil="true"/>
+    <TeamsChannelId xmlns="88cc3c26-756f-41ab-80ed-43e7289fee5b" xsi:nil="true"/>
+    <DefaultSectionNames xmlns="88cc3c26-756f-41ab-80ed-43e7289fee5b" xsi:nil="true"/>
+    <Teams_Channel_Section_Location xmlns="88cc3c26-756f-41ab-80ed-43e7289fee5b" xsi:nil="true"/>
+    <CultureName xmlns="88cc3c26-756f-41ab-80ed-43e7289fee5b" xsi:nil="true"/>
+    <Owner xmlns="88cc3c26-756f-41ab-80ed-43e7289fee5b">
+      <UserInfo>
+        <DisplayName/>
+        <AccountId xsi:nil="true"/>
+        <AccountType/>
+      </UserInfo>
+    </Owner>
+    <Distribution_Groups xmlns="88cc3c26-756f-41ab-80ed-43e7289fee5b" xsi:nil="true"/>
+    <Invited_Teachers xmlns="88cc3c26-756f-41ab-80ed-43e7289fee5b" xsi:nil="true"/>
+    <Templates xmlns="88cc3c26-756f-41ab-80ed-43e7289fee5b" xsi:nil="true"/>
+    <NotebookType xmlns="88cc3c26-756f-41ab-80ed-43e7289fee5b" xsi:nil="true"/>
+    <lcf76f155ced4ddcb4097134ff3c332f xmlns="88cc3c26-756f-41ab-80ed-43e7289fee5b">
+      <Terms xmlns="http://schemas.microsoft.com/office/infopath/2007/PartnerControls"/>
+    </lcf76f155ced4ddcb4097134ff3c332f>
+    <TaxCatchAll xmlns="55239288-d498-4dd6-9609-491b39ec8fae" xsi:nil="true"/>
+    <AppVersion xmlns="88cc3c26-756f-41ab-80ed-43e7289fee5b" xsi:nil="true"/>
+    <Teachers xmlns="88cc3c26-756f-41ab-80ed-43e7289fee5b">
+      <UserInfo>
+        <DisplayName/>
+        <AccountId xsi:nil="true"/>
+        <AccountType/>
+      </UserInfo>
+    </Teachers>
+    <Students xmlns="88cc3c26-756f-41ab-80ed-43e7289fee5b">
+      <UserInfo>
+        <DisplayName/>
+        <AccountId xsi:nil="true"/>
+        <AccountType/>
+      </UserInfo>
+    </Students>
+    <Student_Groups xmlns="88cc3c26-756f-41ab-80ed-43e7289fee5b">
+      <UserInfo>
+        <DisplayName/>
+        <AccountId xsi:nil="true"/>
+        <AccountType/>
+      </UserInfo>
+    </Student_Groups>
+    <Invited_Students xmlns="88cc3c26-756f-41ab-80ed-43e7289fee5b" xsi:nil="true"/>
+    <IsNotebookLocked xmlns="88cc3c26-756f-41ab-80ed-43e7289fee5b" xsi:nil="true"/>
+    <Math_Settings xmlns="88cc3c26-756f-41ab-80ed-43e7289fee5b" xsi:nil="true"/>
+    <Self_Registration_Enabled xmlns="88cc3c26-756f-41ab-80ed-43e7289fee5b" xsi:nil="true"/>
+  </documentManagement>
+</p:properties>
+</file>
+
+<file path=customXml/item2.xml><?xml version="1.0" encoding="utf-8"?>
 <b:Sources xmlns:b="http://schemas.openxmlformats.org/officeDocument/2006/bibliography" xmlns="http://schemas.openxmlformats.org/officeDocument/2006/bibliography" SelectedStyle="\APASixthEditionOfficeOnline.xsl" StyleName="APA" Version="6"/>
 </file>
 
-<file path=customXml/item2.xml><?xml version="1.0" encoding="utf-8"?>
+<file path=customXml/item3.xml><?xml version="1.0" encoding="utf-8"?>
+<?mso-contentType ?>
+<FormTemplates xmlns="http://schemas.microsoft.com/sharepoint/v3/contenttype/forms">
+  <Display>DocumentLibraryForm</Display>
+  <Edit>DocumentLibraryForm</Edit>
+  <New>DocumentLibraryForm</New>
+</FormTemplates>
+</file>
+
+<file path=customXml/item4.xml><?xml version="1.0" encoding="utf-8"?>
 <ct:contentTypeSchema xmlns:ct="http://schemas.microsoft.com/office/2006/metadata/contentType" xmlns:ma="http://schemas.microsoft.com/office/2006/metadata/properties/metaAttributes" ct:_="" ma:_="" ma:contentTypeName="ドキュメント" ma:contentTypeID="0x01010058BEBA3CD4E69545839402B5D4E5400B" ma:contentTypeVersion="32" ma:contentTypeDescription="新しいドキュメントを作成します。" ma:contentTypeScope="" ma:versionID="d08d65a4a74900d620267197f406b651">
   <xsd:schema xmlns:xsd="http://www.w3.org/2001/XMLSchema" xmlns:xs="http://www.w3.org/2001/XMLSchema" xmlns:p="http://schemas.microsoft.com/office/2006/metadata/properties" xmlns:ns2="88cc3c26-756f-41ab-80ed-43e7289fee5b" xmlns:ns3="55239288-d498-4dd6-9609-491b39ec8fae" targetNamespace="http://schemas.microsoft.com/office/2006/metadata/properties" ma:root="true" ma:fieldsID="7e61fd7b041af266c3d334b158082328" ns2:_="" ns3:_="">
     <xsd:import namespace="88cc3c26-756f-41ab-80ed-43e7289fee5b"/>
@@ -6866,72 +6959,18 @@
 </ct:contentTypeSchema>
 </file>
 
-<file path=customXml/item3.xml><?xml version="1.0" encoding="utf-8"?>
-<?mso-contentType ?>
-<FormTemplates xmlns="http://schemas.microsoft.com/sharepoint/v3/contenttype/forms">
-  <Display>DocumentLibraryForm</Display>
-  <Edit>DocumentLibraryForm</Edit>
-  <New>DocumentLibraryForm</New>
-</FormTemplates>
+<file path=customXml/itemProps1.xml><?xml version="1.0" encoding="utf-8"?>
+<ds:datastoreItem xmlns:ds="http://schemas.openxmlformats.org/officeDocument/2006/customXml" ds:itemID="{F7A36BCC-A641-4C4C-BE7A-CDB1C212617B}">
+  <ds:schemaRefs>
+    <ds:schemaRef ds:uri="http://schemas.microsoft.com/office/2006/metadata/properties"/>
+    <ds:schemaRef ds:uri="http://schemas.microsoft.com/office/infopath/2007/PartnerControls"/>
+    <ds:schemaRef ds:uri="88cc3c26-756f-41ab-80ed-43e7289fee5b"/>
+    <ds:schemaRef ds:uri="55239288-d498-4dd6-9609-491b39ec8fae"/>
+  </ds:schemaRefs>
+</ds:datastoreItem>
 </file>
 
-<file path=customXml/item4.xml><?xml version="1.0" encoding="utf-8"?>
-<p:properties xmlns:p="http://schemas.microsoft.com/office/2006/metadata/properties" xmlns:xsi="http://www.w3.org/2001/XMLSchema-instance" xmlns:pc="http://schemas.microsoft.com/office/infopath/2007/PartnerControls">
-  <documentManagement>
-    <LMS_Mappings xmlns="88cc3c26-756f-41ab-80ed-43e7289fee5b" xsi:nil="true"/>
-    <Is_Collaboration_Space_Locked xmlns="88cc3c26-756f-41ab-80ed-43e7289fee5b" xsi:nil="true"/>
-    <Has_Teacher_Only_SectionGroup xmlns="88cc3c26-756f-41ab-80ed-43e7289fee5b" xsi:nil="true"/>
-    <FolderType xmlns="88cc3c26-756f-41ab-80ed-43e7289fee5b" xsi:nil="true"/>
-    <TeamsChannelId xmlns="88cc3c26-756f-41ab-80ed-43e7289fee5b" xsi:nil="true"/>
-    <DefaultSectionNames xmlns="88cc3c26-756f-41ab-80ed-43e7289fee5b" xsi:nil="true"/>
-    <Teams_Channel_Section_Location xmlns="88cc3c26-756f-41ab-80ed-43e7289fee5b" xsi:nil="true"/>
-    <CultureName xmlns="88cc3c26-756f-41ab-80ed-43e7289fee5b" xsi:nil="true"/>
-    <Owner xmlns="88cc3c26-756f-41ab-80ed-43e7289fee5b">
-      <UserInfo>
-        <DisplayName/>
-        <AccountId xsi:nil="true"/>
-        <AccountType/>
-      </UserInfo>
-    </Owner>
-    <Distribution_Groups xmlns="88cc3c26-756f-41ab-80ed-43e7289fee5b" xsi:nil="true"/>
-    <Invited_Teachers xmlns="88cc3c26-756f-41ab-80ed-43e7289fee5b" xsi:nil="true"/>
-    <Templates xmlns="88cc3c26-756f-41ab-80ed-43e7289fee5b" xsi:nil="true"/>
-    <NotebookType xmlns="88cc3c26-756f-41ab-80ed-43e7289fee5b" xsi:nil="true"/>
-    <lcf76f155ced4ddcb4097134ff3c332f xmlns="88cc3c26-756f-41ab-80ed-43e7289fee5b">
-      <Terms xmlns="http://schemas.microsoft.com/office/infopath/2007/PartnerControls"/>
-    </lcf76f155ced4ddcb4097134ff3c332f>
-    <TaxCatchAll xmlns="55239288-d498-4dd6-9609-491b39ec8fae" xsi:nil="true"/>
-    <AppVersion xmlns="88cc3c26-756f-41ab-80ed-43e7289fee5b" xsi:nil="true"/>
-    <Teachers xmlns="88cc3c26-756f-41ab-80ed-43e7289fee5b">
-      <UserInfo>
-        <DisplayName/>
-        <AccountId xsi:nil="true"/>
-        <AccountType/>
-      </UserInfo>
-    </Teachers>
-    <Students xmlns="88cc3c26-756f-41ab-80ed-43e7289fee5b">
-      <UserInfo>
-        <DisplayName/>
-        <AccountId xsi:nil="true"/>
-        <AccountType/>
-      </UserInfo>
-    </Students>
-    <Student_Groups xmlns="88cc3c26-756f-41ab-80ed-43e7289fee5b">
-      <UserInfo>
-        <DisplayName/>
-        <AccountId xsi:nil="true"/>
-        <AccountType/>
-      </UserInfo>
-    </Student_Groups>
-    <Invited_Students xmlns="88cc3c26-756f-41ab-80ed-43e7289fee5b" xsi:nil="true"/>
-    <IsNotebookLocked xmlns="88cc3c26-756f-41ab-80ed-43e7289fee5b" xsi:nil="true"/>
-    <Math_Settings xmlns="88cc3c26-756f-41ab-80ed-43e7289fee5b" xsi:nil="true"/>
-    <Self_Registration_Enabled xmlns="88cc3c26-756f-41ab-80ed-43e7289fee5b" xsi:nil="true"/>
-  </documentManagement>
-</p:properties>
-</file>
-
-<file path=customXml/itemProps1.xml><?xml version="1.0" encoding="utf-8"?>
+<file path=customXml/itemProps2.xml><?xml version="1.0" encoding="utf-8"?>
 <ds:datastoreItem xmlns:ds="http://schemas.openxmlformats.org/officeDocument/2006/customXml" ds:itemID="{A997264C-FB66-4574-998F-65B7E32CD014}">
   <ds:schemaRefs>
     <ds:schemaRef ds:uri="http://schemas.openxmlformats.org/officeDocument/2006/bibliography"/>
@@ -6939,14 +6978,29 @@
 </ds:datastoreItem>
 </file>
 
-<file path=customXml/itemProps2.xml><?xml version="1.0" encoding="utf-8"?>
-<ds:datastoreItem xmlns:ds="http://schemas.openxmlformats.org/officeDocument/2006/customXml" ds:itemID="{1FDFECD9-C99E-4364-99F7-53A688E43CFB}"/>
-</file>
-
 <file path=customXml/itemProps3.xml><?xml version="1.0" encoding="utf-8"?>
-<ds:datastoreItem xmlns:ds="http://schemas.openxmlformats.org/officeDocument/2006/customXml" ds:itemID="{C03D2857-18D9-4094-88E7-492ACACF2934}"/>
+<ds:datastoreItem xmlns:ds="http://schemas.openxmlformats.org/officeDocument/2006/customXml" ds:itemID="{C03D2857-18D9-4094-88E7-492ACACF2934}">
+  <ds:schemaRefs>
+    <ds:schemaRef ds:uri="http://schemas.microsoft.com/sharepoint/v3/contenttype/forms"/>
+  </ds:schemaRefs>
+</ds:datastoreItem>
 </file>
 
 <file path=customXml/itemProps4.xml><?xml version="1.0" encoding="utf-8"?>
-<ds:datastoreItem xmlns:ds="http://schemas.openxmlformats.org/officeDocument/2006/customXml" ds:itemID="{F7A36BCC-A641-4C4C-BE7A-CDB1C212617B}"/>
+<ds:datastoreItem xmlns:ds="http://schemas.openxmlformats.org/officeDocument/2006/customXml" ds:itemID="{1FDFECD9-C99E-4364-99F7-53A688E43CFB}">
+  <ds:schemaRefs>
+    <ds:schemaRef ds:uri="http://schemas.microsoft.com/office/2006/metadata/contentType"/>
+    <ds:schemaRef ds:uri="http://schemas.microsoft.com/office/2006/metadata/properties/metaAttributes"/>
+    <ds:schemaRef ds:uri="http://www.w3.org/2001/XMLSchema"/>
+    <ds:schemaRef ds:uri="http://schemas.microsoft.com/office/2006/metadata/properties"/>
+    <ds:schemaRef ds:uri="88cc3c26-756f-41ab-80ed-43e7289fee5b"/>
+    <ds:schemaRef ds:uri="55239288-d498-4dd6-9609-491b39ec8fae"/>
+    <ds:schemaRef ds:uri="http://schemas.microsoft.com/office/2006/documentManagement/types"/>
+    <ds:schemaRef ds:uri="http://schemas.microsoft.com/office/infopath/2007/PartnerControls"/>
+    <ds:schemaRef ds:uri="http://schemas.openxmlformats.org/package/2006/metadata/core-properties"/>
+    <ds:schemaRef ds:uri="http://purl.org/dc/elements/1.1/"/>
+    <ds:schemaRef ds:uri="http://purl.org/dc/terms/"/>
+    <ds:schemaRef ds:uri="http://schemas.microsoft.com/internal/obd"/>
+  </ds:schemaRefs>
+</ds:datastoreItem>
 </file>
</xml_diff>